<commit_message>
Improve PA1 formatting and remove competency survey section
- Section 1.2 (Danh sach thanh vien va vai tro): render each
  "Ly do phan cong" reason as its own bullet line instead of one
  run-on paragraph with inline bullet markers
- Set submission date to 09/07/2026
- Remove section 1.3 (Nang luc, kinh nghiem tung thanh vien) since
  the survey results are not meant to be published; renumber
  subsequent sections 1.4-1.7 to 1.3-1.6 accordingly, including the
  cross-reference in the org-chart section
- Applies to PA1.docx, PA1.pdf, and PA1.md alike
</commit_message>
<xml_diff>
--- a/docs/PA1-doi-ngu/PA1.docx
+++ b/docs/PA1-doi-ngu/PA1.docx
@@ -422,7 +422,7 @@
                 <w:b w:val="0"/>
                 <w:sz w:val="22"/>
               </w:rPr>
-              <w:t>[Cần bổ sung]</w:t>
+              <w:t>09/07/2026</w:t>
             </w:r>
           </w:p>
         </w:tc>
@@ -689,17 +689,59 @@
         <w:tc>
           <w:tcPr>
             <w:tcW w:type="dxa" w:w="5328"/>
-            <w:vAlign w:val="center"/>
+            <w:vAlign w:val="top"/>
           </w:tcPr>
           <w:p>
+            <w:pPr>
+              <w:spacing w:after="80"/>
+              <w:ind w:left="216"/>
+            </w:pPr>
             <w:r/>
             <w:r>
               <w:rPr>
                 <w:rFonts w:ascii="Times New Roman" w:hAnsi="Times New Roman"/>
-                <w:b w:val="0"/>
                 <w:sz w:val="19"/>
               </w:rPr>
-              <w:t>• Giữ vai trò CEO từ PA0 do nhóm bầu nên và đã nắm tổng quan dự án cũng như quá trình điều phối nhóm. • Việc tiếp tục giữ vai trò này giúp đảm bảo tính liên tục giữa các PA. • Các thành viên đều đồng ý cho vị trí CEO của Phú hiện tại. • Tiếp tục chịu trách nhiệm định hướng dự án, phân công công việc, theo dõi tiến độ và đưa ra các quyết định cuối cùng.</w:t>
+              <w:t>•  Giữ vai trò CEO từ PA0 do nhóm bầu nên và đã nắm tổng quan dự án cũng như quá trình điều phối nhóm.</w:t>
+            </w:r>
+          </w:p>
+          <w:p>
+            <w:pPr>
+              <w:spacing w:after="80"/>
+              <w:ind w:left="216"/>
+            </w:pPr>
+            <w:r>
+              <w:rPr>
+                <w:rFonts w:ascii="Times New Roman" w:hAnsi="Times New Roman"/>
+                <w:sz w:val="19"/>
+              </w:rPr>
+              <w:t>•  Việc tiếp tục giữ vai trò này giúp đảm bảo tính liên tục giữa các PA.</w:t>
+            </w:r>
+          </w:p>
+          <w:p>
+            <w:pPr>
+              <w:spacing w:after="80"/>
+              <w:ind w:left="216"/>
+            </w:pPr>
+            <w:r>
+              <w:rPr>
+                <w:rFonts w:ascii="Times New Roman" w:hAnsi="Times New Roman"/>
+                <w:sz w:val="19"/>
+              </w:rPr>
+              <w:t>•  Các thành viên đều đồng ý cho vị trí CEO của Phú hiện tại.</w:t>
+            </w:r>
+          </w:p>
+          <w:p>
+            <w:pPr>
+              <w:spacing w:after="80"/>
+              <w:ind w:left="216"/>
+            </w:pPr>
+            <w:r>
+              <w:rPr>
+                <w:rFonts w:ascii="Times New Roman" w:hAnsi="Times New Roman"/>
+                <w:sz w:val="19"/>
+              </w:rPr>
+              <w:t>•  Tiếp tục chịu trách nhiệm định hướng dự án, phân công công việc, theo dõi tiến độ và đưa ra các quyết định cuối cùng.</w:t>
             </w:r>
           </w:p>
         </w:tc>
@@ -742,17 +784,59 @@
         <w:tc>
           <w:tcPr>
             <w:tcW w:type="dxa" w:w="5328"/>
-            <w:vAlign w:val="center"/>
+            <w:vAlign w:val="top"/>
           </w:tcPr>
           <w:p>
+            <w:pPr>
+              <w:spacing w:after="80"/>
+              <w:ind w:left="216"/>
+            </w:pPr>
             <w:r/>
             <w:r>
               <w:rPr>
                 <w:rFonts w:ascii="Times New Roman" w:hAnsi="Times New Roman"/>
-                <w:b w:val="0"/>
                 <w:sz w:val="19"/>
               </w:rPr>
-              <w:t>• Kiều Duyên có kinh nghiệm ở các vai trò Frontend, UI/UX, Business Analyst và Project Manager, đồng thời từng làm Leader ở nhiều đồ án. • Điểm mạnh nổi bật là xử lý, lưu trữ và trực quan hóa dữ liệu. Trong khảo sát, Duyên mong muốn phụ trách truyền thông, làm việc với khách hàng và đối tác. • Ngoài ra, Duyên cũng bày tỏ hứng thú với việc tính toán mô hình doanh thu và tài chính của startup. • Những năng lực này phù hợp với vai trò Marketing &amp; Growth Lead, chịu trách nhiệm nghiên cứu thị trường, xây dựng chiến lược tiếp cận khách hàng, quảng bá sản phẩm và hỗ trợ phát triển đối tác nhằm gia tăng lượng người dùng cho NutriPlan.</w:t>
+              <w:t>•  Kiều Duyên có kinh nghiệm ở các vai trò Frontend, UI/UX, Business Analyst và Project Manager, đồng thời từng làm Leader ở nhiều đồ án.</w:t>
+            </w:r>
+          </w:p>
+          <w:p>
+            <w:pPr>
+              <w:spacing w:after="80"/>
+              <w:ind w:left="216"/>
+            </w:pPr>
+            <w:r>
+              <w:rPr>
+                <w:rFonts w:ascii="Times New Roman" w:hAnsi="Times New Roman"/>
+                <w:sz w:val="19"/>
+              </w:rPr>
+              <w:t>•  Điểm mạnh nổi bật là xử lý, lưu trữ và trực quan hóa dữ liệu. Trong khảo sát, Duyên mong muốn phụ trách truyền thông, làm việc với khách hàng và đối tác.</w:t>
+            </w:r>
+          </w:p>
+          <w:p>
+            <w:pPr>
+              <w:spacing w:after="80"/>
+              <w:ind w:left="216"/>
+            </w:pPr>
+            <w:r>
+              <w:rPr>
+                <w:rFonts w:ascii="Times New Roman" w:hAnsi="Times New Roman"/>
+                <w:sz w:val="19"/>
+              </w:rPr>
+              <w:t>•  Ngoài ra, Duyên cũng bày tỏ hứng thú với việc tính toán mô hình doanh thu và tài chính của startup.</w:t>
+            </w:r>
+          </w:p>
+          <w:p>
+            <w:pPr>
+              <w:spacing w:after="80"/>
+              <w:ind w:left="216"/>
+            </w:pPr>
+            <w:r>
+              <w:rPr>
+                <w:rFonts w:ascii="Times New Roman" w:hAnsi="Times New Roman"/>
+                <w:sz w:val="19"/>
+              </w:rPr>
+              <w:t>•  Những năng lực này phù hợp với vai trò Marketing &amp; Growth Lead, chịu trách nhiệm nghiên cứu thị trường, xây dựng chiến lược tiếp cận khách hàng, quảng bá sản phẩm và hỗ trợ phát triển đối tác nhằm gia tăng lượng người dùng cho NutriPlan.</w:t>
             </w:r>
           </w:p>
         </w:tc>
@@ -795,17 +879,59 @@
         <w:tc>
           <w:tcPr>
             <w:tcW w:type="dxa" w:w="5328"/>
-            <w:vAlign w:val="center"/>
+            <w:vAlign w:val="top"/>
           </w:tcPr>
           <w:p>
+            <w:pPr>
+              <w:spacing w:after="80"/>
+              <w:ind w:left="216"/>
+            </w:pPr>
             <w:r/>
             <w:r>
               <w:rPr>
                 <w:rFonts w:ascii="Times New Roman" w:hAnsi="Times New Roman"/>
-                <w:b w:val="0"/>
                 <w:sz w:val="19"/>
               </w:rPr>
-              <w:t>• Bảo có kinh nghiệm đa dạng nhất về phát triển phần mềm với Frontend, Backend, Full-stack, Mobile Development và UI/UX Design. • Thành viên này mong muốn phụ trách lập trình, thiết kế giao diện và nghiên cứu đối thủ. • Điểm mạnh được chia sẻ là khả năng thiết kế UI/UX và lập trình, đồng thời tự tin bảo vệ các quyết định kỹ thuật trước hội đồng. • Với nền tảng kỹ thuật toàn diện, Bảo phù hợp đảm nhiệm vai trò phát triển trực tiếp sản phẩm, hiện thực hóa các chức năng của NutriPlan và thiết kế giao diện thân thiện với người dùng. Đây cũng là vai trò quan trọng trong giai đoạn xây dựng MVP.</w:t>
+              <w:t>•  Bảo có kinh nghiệm đa dạng nhất về phát triển phần mềm với Frontend, Backend, Full-stack, Mobile Development và UI/UX Design.</w:t>
+            </w:r>
+          </w:p>
+          <w:p>
+            <w:pPr>
+              <w:spacing w:after="80"/>
+              <w:ind w:left="216"/>
+            </w:pPr>
+            <w:r>
+              <w:rPr>
+                <w:rFonts w:ascii="Times New Roman" w:hAnsi="Times New Roman"/>
+                <w:sz w:val="19"/>
+              </w:rPr>
+              <w:t>•  Thành viên này mong muốn phụ trách lập trình, thiết kế giao diện và nghiên cứu đối thủ.</w:t>
+            </w:r>
+          </w:p>
+          <w:p>
+            <w:pPr>
+              <w:spacing w:after="80"/>
+              <w:ind w:left="216"/>
+            </w:pPr>
+            <w:r>
+              <w:rPr>
+                <w:rFonts w:ascii="Times New Roman" w:hAnsi="Times New Roman"/>
+                <w:sz w:val="19"/>
+              </w:rPr>
+              <w:t>•  Điểm mạnh được chia sẻ là khả năng thiết kế UI/UX và lập trình, đồng thời tự tin bảo vệ các quyết định kỹ thuật trước hội đồng.</w:t>
+            </w:r>
+          </w:p>
+          <w:p>
+            <w:pPr>
+              <w:spacing w:after="80"/>
+              <w:ind w:left="216"/>
+            </w:pPr>
+            <w:r>
+              <w:rPr>
+                <w:rFonts w:ascii="Times New Roman" w:hAnsi="Times New Roman"/>
+                <w:sz w:val="19"/>
+              </w:rPr>
+              <w:t>•  Với nền tảng kỹ thuật toàn diện, Bảo phù hợp đảm nhiệm vai trò phát triển trực tiếp sản phẩm, hiện thực hóa các chức năng của NutriPlan và thiết kế giao diện thân thiện với người dùng. Đây cũng là vai trò quan trọng trong giai đoạn xây dựng MVP.</w:t>
             </w:r>
           </w:p>
         </w:tc>
@@ -848,17 +974,46 @@
         <w:tc>
           <w:tcPr>
             <w:tcW w:type="dxa" w:w="5328"/>
-            <w:vAlign w:val="center"/>
+            <w:vAlign w:val="top"/>
           </w:tcPr>
           <w:p>
+            <w:pPr>
+              <w:spacing w:after="80"/>
+              <w:ind w:left="216"/>
+            </w:pPr>
             <w:r/>
             <w:r>
               <w:rPr>
                 <w:rFonts w:ascii="Times New Roman" w:hAnsi="Times New Roman"/>
-                <w:b w:val="0"/>
                 <w:sz w:val="19"/>
               </w:rPr>
-              <w:t>• Thành là thành viên có kinh nghiệm kỹ thuật nổi bật nhất trong nhóm, đã tham gia trên 6 dự án, từng đảm nhiệm Frontend, Backend và Business Analyst, đồng thời đã có kinh nghiệm làm Project Leader. • Ngoài ra, Thành mong muốn phụ trách kiến trúc công nghệ và nghiên cứu sản phẩm đối thủ. Thành cũng cho biết mình tự tin trình bày chiến lược Go-to-Market và sẵn sàng trực tiếp xử lý các vấn đề kỹ thuật khi sản phẩm gặp sự cố. • Vì vậy, Thành phù hợp đảm nhiệm vai trò CTO, chịu trách nhiệm thiết kế kiến trúc hệ thống, lựa chọn công nghệ và dẫn dắt quá trình phát triển sản phẩm MVP. Vai trò này phù hợp với tiêu chí của Founding Engineer trong mô hình startup.</w:t>
+              <w:t>•  Thành là thành viên có kinh nghiệm kỹ thuật nổi bật nhất trong nhóm, đã tham gia trên 6 dự án, từng đảm nhiệm Frontend, Backend và Business Analyst, đồng thời đã có kinh nghiệm làm Project Leader.</w:t>
+            </w:r>
+          </w:p>
+          <w:p>
+            <w:pPr>
+              <w:spacing w:after="80"/>
+              <w:ind w:left="216"/>
+            </w:pPr>
+            <w:r>
+              <w:rPr>
+                <w:rFonts w:ascii="Times New Roman" w:hAnsi="Times New Roman"/>
+                <w:sz w:val="19"/>
+              </w:rPr>
+              <w:t>•  Ngoài ra, Thành mong muốn phụ trách kiến trúc công nghệ và nghiên cứu sản phẩm đối thủ. Thành cũng cho biết mình tự tin trình bày chiến lược Go-to-Market và sẵn sàng trực tiếp xử lý các vấn đề kỹ thuật khi sản phẩm gặp sự cố.</w:t>
+            </w:r>
+          </w:p>
+          <w:p>
+            <w:pPr>
+              <w:spacing w:after="80"/>
+              <w:ind w:left="216"/>
+            </w:pPr>
+            <w:r>
+              <w:rPr>
+                <w:rFonts w:ascii="Times New Roman" w:hAnsi="Times New Roman"/>
+                <w:sz w:val="19"/>
+              </w:rPr>
+              <w:t>•  Vì vậy, Thành phù hợp đảm nhiệm vai trò CTO, chịu trách nhiệm thiết kế kiến trúc hệ thống, lựa chọn công nghệ và dẫn dắt quá trình phát triển sản phẩm MVP. Vai trò này phù hợp với tiêu chí của Founding Engineer trong mô hình startup.</w:t>
             </w:r>
           </w:p>
         </w:tc>
@@ -901,17 +1056,59 @@
         <w:tc>
           <w:tcPr>
             <w:tcW w:type="dxa" w:w="5328"/>
-            <w:vAlign w:val="center"/>
+            <w:vAlign w:val="top"/>
           </w:tcPr>
           <w:p>
+            <w:pPr>
+              <w:spacing w:after="80"/>
+              <w:ind w:left="216"/>
+            </w:pPr>
             <w:r/>
             <w:r>
               <w:rPr>
                 <w:rFonts w:ascii="Times New Roman" w:hAnsi="Times New Roman"/>
-                <w:b w:val="0"/>
                 <w:sz w:val="19"/>
               </w:rPr>
-              <w:t>• Theo khảo sát, Phúc có kinh nghiệm Frontend, UI/UX Design và Tester. Tuy nhiên, điểm mạnh nổi bật nhất là khả năng phân tích tình huống, giao tiếp và thuyết trình trước khách hàng. • Phúc mong muốn phụ trách truyền thông, liên hệ khách hàng, hỗ trợ đối tác và nghiên cứu sản phẩm đối thủ. • Với những năng lực này, Phúc phù hợp đảm nhiệm vai trò Business Development &amp; Customer Success, tập trung tìm kiếm và duy trì mối quan hệ với khách hàng, kết nối các bếp ăn đối tác, hỗ trợ truyền thông và tiếp nhận phản hồi của người dùng để cải thiện sản phẩm. • Vai trò này đặc biệt quan trọng đối với NutriPlan vì mô hình kinh doanh subscription đòi hỏi vừa thu hút khách hàng mới vừa duy trì tỷ lệ gia hạn dịch vụ.</w:t>
+              <w:t>•  Theo khảo sát, Phúc có kinh nghiệm Frontend, UI/UX Design và Tester. Tuy nhiên, điểm mạnh nổi bật nhất là khả năng phân tích tình huống, giao tiếp và thuyết trình trước khách hàng.</w:t>
+            </w:r>
+          </w:p>
+          <w:p>
+            <w:pPr>
+              <w:spacing w:after="80"/>
+              <w:ind w:left="216"/>
+            </w:pPr>
+            <w:r>
+              <w:rPr>
+                <w:rFonts w:ascii="Times New Roman" w:hAnsi="Times New Roman"/>
+                <w:sz w:val="19"/>
+              </w:rPr>
+              <w:t>•  Phúc mong muốn phụ trách truyền thông, liên hệ khách hàng, hỗ trợ đối tác và nghiên cứu sản phẩm đối thủ.</w:t>
+            </w:r>
+          </w:p>
+          <w:p>
+            <w:pPr>
+              <w:spacing w:after="80"/>
+              <w:ind w:left="216"/>
+            </w:pPr>
+            <w:r>
+              <w:rPr>
+                <w:rFonts w:ascii="Times New Roman" w:hAnsi="Times New Roman"/>
+                <w:sz w:val="19"/>
+              </w:rPr>
+              <w:t>•  Với những năng lực này, Phúc phù hợp đảm nhiệm vai trò Business Development &amp; Customer Success, tập trung tìm kiếm và duy trì mối quan hệ với khách hàng, kết nối các bếp ăn đối tác, hỗ trợ truyền thông và tiếp nhận phản hồi của người dùng để cải thiện sản phẩm.</w:t>
+            </w:r>
+          </w:p>
+          <w:p>
+            <w:pPr>
+              <w:spacing w:after="80"/>
+              <w:ind w:left="216"/>
+            </w:pPr>
+            <w:r>
+              <w:rPr>
+                <w:rFonts w:ascii="Times New Roman" w:hAnsi="Times New Roman"/>
+                <w:sz w:val="19"/>
+              </w:rPr>
+              <w:t>•  Vai trò này đặc biệt quan trọng đối với NutriPlan vì mô hình kinh doanh subscription đòi hỏi vừa thu hút khách hàng mới vừa duy trì tỷ lệ gia hạn dịch vụ.</w:t>
             </w:r>
           </w:p>
         </w:tc>
@@ -954,17 +1151,59 @@
         <w:tc>
           <w:tcPr>
             <w:tcW w:type="dxa" w:w="5328"/>
-            <w:vAlign w:val="center"/>
+            <w:vAlign w:val="top"/>
           </w:tcPr>
           <w:p>
+            <w:pPr>
+              <w:spacing w:after="80"/>
+              <w:ind w:left="216"/>
+            </w:pPr>
             <w:r/>
             <w:r>
               <w:rPr>
                 <w:rFonts w:ascii="Times New Roman" w:hAnsi="Times New Roman"/>
-                <w:b w:val="0"/>
                 <w:sz w:val="19"/>
               </w:rPr>
-              <w:t>• Dũng có kinh nghiệm ở các vai trò UI/UX Design, Business Analyst, Project Manager và Tester. • Trong khảo sát, Dũng mong muốn phụ trách vận hành, theo dõi timeline, báo cáo tiến độ và hỗ trợ thiết kế giao diện. • Điểm mạnh của Dũng là chịu khó, biết lắng nghe và sẵn sàng thích nghi với thay đổi. • Đây là những phẩm chất phù hợp với vị trí Operations Manager, chịu trách nhiệm theo dõi tiến độ dự án, phối hợp giữa các thành viên, chuẩn hóa quy trình làm việc và trong tương lai là quản lý hoạt động với các bếp ăn đối tác cũng như quy trình giao hàng của NutriPlan.</w:t>
+              <w:t>•  Dũng có kinh nghiệm ở các vai trò UI/UX Design, Business Analyst, Project Manager và Tester.</w:t>
+            </w:r>
+          </w:p>
+          <w:p>
+            <w:pPr>
+              <w:spacing w:after="80"/>
+              <w:ind w:left="216"/>
+            </w:pPr>
+            <w:r>
+              <w:rPr>
+                <w:rFonts w:ascii="Times New Roman" w:hAnsi="Times New Roman"/>
+                <w:sz w:val="19"/>
+              </w:rPr>
+              <w:t>•  Trong khảo sát, Dũng mong muốn phụ trách vận hành, theo dõi timeline, báo cáo tiến độ và hỗ trợ thiết kế giao diện.</w:t>
+            </w:r>
+          </w:p>
+          <w:p>
+            <w:pPr>
+              <w:spacing w:after="80"/>
+              <w:ind w:left="216"/>
+            </w:pPr>
+            <w:r>
+              <w:rPr>
+                <w:rFonts w:ascii="Times New Roman" w:hAnsi="Times New Roman"/>
+                <w:sz w:val="19"/>
+              </w:rPr>
+              <w:t>•  Điểm mạnh của Dũng là chịu khó, biết lắng nghe và sẵn sàng thích nghi với thay đổi.</w:t>
+            </w:r>
+          </w:p>
+          <w:p>
+            <w:pPr>
+              <w:spacing w:after="80"/>
+              <w:ind w:left="216"/>
+            </w:pPr>
+            <w:r>
+              <w:rPr>
+                <w:rFonts w:ascii="Times New Roman" w:hAnsi="Times New Roman"/>
+                <w:sz w:val="19"/>
+              </w:rPr>
+              <w:t>•  Đây là những phẩm chất phù hợp với vị trí Operations Manager, chịu trách nhiệm theo dõi tiến độ dự án, phối hợp giữa các thành viên, chuẩn hóa quy trình làm việc và trong tương lai là quản lý hoạt động với các bếp ăn đối tác cũng như quy trình giao hàng của NutriPlan.</w:t>
             </w:r>
           </w:p>
         </w:tc>
@@ -1004,77 +1243,7 @@
                 <w:color w:val="FFFFFF"/>
                 <w:sz w:val="24"/>
               </w:rPr>
-              <w:t>1.3  Năng Lực, Kinh Nghiệm, Kỹ Năng Liên Quan Của Từng Thành Viên</w:t>
-            </w:r>
-          </w:p>
-        </w:tc>
-      </w:tr>
-    </w:tbl>
-    <w:p>
-      <w:pPr>
-        <w:spacing w:after="120"/>
-      </w:pPr>
-    </w:p>
-    <w:p>
-      <w:pPr>
-        <w:spacing w:after="120"/>
-        <w:jc w:val="left"/>
-      </w:pPr>
-      <w:r>
-        <w:rPr>
-          <w:rFonts w:ascii="Times New Roman" w:hAnsi="Times New Roman"/>
-          <w:b/>
-          <w:i w:val="0"/>
-          <w:sz w:val="22"/>
-        </w:rPr>
-        <w:t>Trạng thái: chưa hoàn thành — cần điền.</w:t>
-      </w:r>
-    </w:p>
-    <w:p>
-      <w:pPr>
-        <w:spacing w:after="120"/>
-        <w:jc w:val="left"/>
-      </w:pPr>
-      <w:r>
-        <w:rPr>
-          <w:rFonts w:ascii="Times New Roman" w:hAnsi="Times New Roman"/>
-          <w:b w:val="0"/>
-          <w:i w:val="0"/>
-          <w:sz w:val="22"/>
-        </w:rPr>
-        <w:t>Nhóm chưa hoàn thành Form khảo sát năng lực (Task 2) như một tài liệu độc lập; do đó mục này chưa có bảng tổng hợp kết quả khảo sát chi tiết cho từng thành viên. Thông tin về kinh nghiệm, kỹ năng và mong muốn đảm nhiệm vai trò của từng thành viên — vốn là input để phân công vai trò — đã được ghi nhận trực tiếp trong cột "Lý do phân công" ở Mục 1.2 (Danh sách thành viên và vai trò) phía trên. Khi Form khảo sát được hoàn thiện, bảng kết quả chi tiết sẽ được bổ sung vào mục này.</w:t>
-      </w:r>
-    </w:p>
-    <w:tbl>
-      <w:tblPr>
-        <w:tblW w:type="auto" w:w="0"/>
-        <w:jc w:val="center"/>
-        <w:tblLayout w:type="fixed"/>
-        <w:tblLook w:firstColumn="1" w:firstRow="1" w:lastColumn="0" w:lastRow="0" w:noHBand="0" w:noVBand="1" w:val="04A0"/>
-      </w:tblPr>
-      <w:tblGrid>
-        <w:gridCol w:w="9360"/>
-      </w:tblGrid>
-      <w:tr>
-        <w:tc>
-          <w:tcPr>
-            <w:tcW w:type="dxa" w:w="9360"/>
-            <w:shd w:val="clear" w:color="auto" w:fill="2E74B5"/>
-            <w:vAlign w:val="center"/>
-          </w:tcPr>
-          <w:p>
-            <w:pPr>
-              <w:spacing w:before="80" w:after="80"/>
-              <w:jc w:val="left"/>
-            </w:pPr>
-            <w:r>
-              <w:rPr>
-                <w:rFonts w:ascii="Times New Roman" w:hAnsi="Times New Roman"/>
-                <w:b/>
-                <w:color w:val="FFFFFF"/>
-                <w:sz w:val="24"/>
-              </w:rPr>
-              <w:t>1.4  Lý Do Đội Ngũ Phù Hợp Để Triển Khai Ý Tưởng</w:t>
+              <w:t>1.3  Lý Do Đội Ngũ Phù Hợp Để Triển Khai Ý Tưởng</w:t>
             </w:r>
           </w:p>
         </w:tc>
@@ -1306,7 +1475,7 @@
                 <w:color w:val="FFFFFF"/>
                 <w:sz w:val="24"/>
               </w:rPr>
-              <w:t>1.5  Cơ Cấu Tổ Chức Nhóm/Startup Dự Kiến</w:t>
+              <w:t>1.4  Cơ Cấu Tổ Chức Nhóm/Startup Dự Kiến</w:t>
             </w:r>
           </w:p>
         </w:tc>
@@ -1940,7 +2109,7 @@
           <w:i w:val="0"/>
           <w:sz w:val="22"/>
         </w:rPr>
-        <w:t>Chi tiết các vị trí còn thiếu và kế hoạch bổ sung nhân sự, cố vấn, đối tác được trình bày ở hai mục tiếp theo của Business Plan (Mục 1.6 và 1.7).</w:t>
+        <w:t>Chi tiết các vị trí còn thiếu và kế hoạch bổ sung nhân sự, cố vấn, đối tác được trình bày ở hai mục tiếp theo của Business Plan (Mục 1.5 và 1.6).</w:t>
       </w:r>
     </w:p>
     <w:tbl>
@@ -1972,7 +2141,7 @@
                 <w:color w:val="FFFFFF"/>
                 <w:sz w:val="24"/>
               </w:rPr>
-              <w:t>1.6  Các Vị Trí Hoặc Năng Lực Còn Thiếu Trong Đội Ngũ</w:t>
+              <w:t>1.5  Các Vị Trí Hoặc Năng Lực Còn Thiếu Trong Đội Ngũ</w:t>
             </w:r>
           </w:p>
         </w:tc>
@@ -2554,7 +2723,7 @@
                 <w:color w:val="FFFFFF"/>
                 <w:sz w:val="24"/>
               </w:rPr>
-              <w:t>1.7  Kế Hoạch Bổ Sung Nhân Sự, Cố Vấn Hoặc Đối Tác</w:t>
+              <w:t>1.6  Kế Hoạch Bổ Sung Nhân Sự, Cố Vấn Hoặc Đối Tác</w:t>
             </w:r>
           </w:p>
         </w:tc>

</xml_diff>